<commit_message>
Update AI Assistant Extension
</commit_message>
<xml_diff>
--- a/output/documents/ai-helper/Nghien cuu xu huong nhom18.docx
+++ b/output/documents/ai-helper/Nghien cuu xu huong nhom18.docx
@@ -9,14 +9,6 @@
       </w:pPr>
       <w:r>
         <w:t>Nghiên cứu và đánh giá các xu hướng tích hợp dịch vụ hiện đại cho AI Helper</w:t>
-      </w:r>
-    </w:p>
-    <w:p>
-      <w:pPr>
-        <w:jc w:val="center"/>
-      </w:pPr>
-      <w:r>
-        <w:t>Báo cáo dự án AI Helper</w:t>
       </w:r>
     </w:p>
     <w:p>
@@ -144,10 +136,7 @@
         <w:jc w:val="both"/>
       </w:pPr>
       <w:r>
-        <w:t xml:space="preserve">Phiên bản 0.1.0 dùng MV3, WXT, React, TypeScript, Tailwind và Zustand. API native của OpenAI, Anthropic và Gemini được ánh xạ về luồng văn bản chung. Key mã hóa ở local; lịch sử và tùy chọn không </w:t>
-      </w:r>
-      <w:r>
-        <w:t>có cloud sync. API thật vẫn nhận những tin nhắn và PageContent người dùng chọn gửi.</w:t>
+        <w:t>Phiên bản 0.1.0 dùng MV3, WXT, React, TypeScript, Tailwind và Zustand. API native của OpenAI, Anthropic và Gemini được ánh xạ về luồng văn bản chung. Key mã hóa ở local; lịch sử và tùy chọn không có cloud sync. API thật vẫn nhận những tin nhắn và PageContent người dùng chọn gửi.</w:t>
       </w:r>
     </w:p>
     <w:p>
@@ -223,11 +212,7 @@
         <w:jc w:val="both"/>
       </w:pPr>
       <w:r>
-        <w:t xml:space="preserve">Trong AI Helper, mỗi request chụp provider, model, ngôn ngữ trả lời và ngữ cảnh ở thời điểm gửi. Khóa đi kèm provider đó. Đây là lựa chọn kiểm soát hành vi, </w:t>
-      </w:r>
-      <w:r>
-        <w:lastRenderedPageBreak/>
-        <w:t>không phải một bộ router chọn model tối ưu theo giá hay độ trễ. Nếu người dùng đổi provider ở chat cũ, dữ liệu gần đây sẽ có một bên nhận mới.</w:t>
+        <w:t>Trong AI Helper, mỗi request chụp provider, model, ngôn ngữ trả lời và ngữ cảnh ở thời điểm gửi. Khóa đi kèm provider đó. Đây là lựa chọn kiểm soát hành vi, không phải một bộ router chọn model tối ưu theo giá hay độ trễ. Nếu người dùng đổi provider ở chat cũ, dữ liệu gần đây sẽ có một bên nhận mới.</w:t>
       </w:r>
     </w:p>
     <w:p>
@@ -239,6 +224,7 @@
         </w:numPr>
       </w:pPr>
       <w:r>
+        <w:lastRenderedPageBreak/>
         <w:t>Streaming và trải nghiệm phản hồi</w:t>
       </w:r>
     </w:p>
@@ -339,7 +325,10 @@
         <w:jc w:val="both"/>
       </w:pPr>
       <w:r>
-        <w:t>Luồng theo quy tắc có ưu thế khi đầu vào có cấu trúc và kết quả cần xác định. AI phù hợp hơn với yêu cầu diễn đạt đa dạng nhưng cần tiêu chí đánh giá đầu ra. Trong AI Helper, ghép hai cách tiếp cận là hợp lý: state, permissions, vault và storage giữ tính xác định; mô hình đảm nhận tóm tắt, giải thích, dịch và viết lại.</w:t>
+        <w:t xml:space="preserve">Luồng theo quy tắc có ưu thế khi đầu vào có cấu trúc và kết quả cần xác định. AI phù hợp hơn với yêu cầu diễn đạt đa dạng nhưng cần tiêu chí đánh giá đầu ra. </w:t>
+      </w:r>
+      <w:r>
+        <w:t>Trong AI Helper, ghép hai cách tiếp cận là hợp lý: state, permissions, vault và storage giữ tính xác định; mô hình đảm nhận tóm tắt, giải thích, dịch và viết lại.</w:t>
       </w:r>
     </w:p>
     <w:p>
@@ -431,11 +420,7 @@
         <w:jc w:val="both"/>
       </w:pPr>
       <w:r>
-        <w:t xml:space="preserve">Mesh cũng không thay thế Web Crypto trong browser, không tự chống prompt injection và không giải quyết việc người dùng gửi dữ liệu nhạy cảm. Nếu dự án về sau thực sự có nhiều service backend, nghiên cứu mesh </w:t>
-      </w:r>
-      <w:r>
-        <w:lastRenderedPageBreak/>
-        <w:t>phải xuất phát từ yêu cầu vận hành các service đó, không từ số lượng provider trong dropdown.</w:t>
+        <w:t>Mesh cũng không thay thế Web Crypto trong browser, không tự chống prompt injection và không giải quyết việc người dùng gửi dữ liệu nhạy cảm. Nếu dự án về sau thực sự có nhiều service backend, nghiên cứu mesh phải xuất phát từ yêu cầu vận hành các service đó, không từ số lượng provider trong dropdown.</w:t>
       </w:r>
     </w:p>
     <w:p>
@@ -447,6 +432,7 @@
         </w:numPr>
       </w:pPr>
       <w:r>
+        <w:lastRenderedPageBreak/>
         <w:t>So sánh cho AI Helper</w:t>
       </w:r>
     </w:p>
@@ -559,7 +545,10 @@
         <w:jc w:val="both"/>
       </w:pPr>
       <w:r>
-        <w:t>Với AI, hai model nhận cùng prompt có thể trả khác nhau về độ dài, chất lượng dịch và tuân thủ chỉ dẫn. Thay provider không giống thay một máy chủ có hợp đồng đầu ra hoàn toàn xác định. Vì vậy tính di động phải được đánh giá cả ở giao thức lẫn chất lượng nội dung.</w:t>
+        <w:t xml:space="preserve">Với AI, hai model nhận cùng prompt có thể trả khác nhau về độ dài, chất lượng dịch và tuân thủ chỉ dẫn. Thay provider không giống thay một máy chủ có hợp </w:t>
+      </w:r>
+      <w:r>
+        <w:t>đồng đầu ra hoàn toàn xác định. Vì vậy tính di động phải được đánh giá cả ở giao thức lẫn chất lượng nội dung.</w:t>
       </w:r>
     </w:p>
     <w:p>
@@ -870,7 +859,6 @@
               <w:rPr>
                 <w:sz w:val="19"/>
               </w:rPr>
-              <w:lastRenderedPageBreak/>
               <w:t>API Gateway</w:t>
             </w:r>
           </w:p>
@@ -911,6 +899,7 @@
               <w:rPr>
                 <w:sz w:val="19"/>
               </w:rPr>
+              <w:lastRenderedPageBreak/>
               <w:t>Service Mesh</w:t>
             </w:r>
           </w:p>
@@ -1068,10 +1057,7 @@
         <w:jc w:val="both"/>
       </w:pPr>
       <w:r>
-        <w:t xml:space="preserve">Đối với UI, offline là một trạng thái bình thường cần diễn đạt. Giữ bản nháp, báo mất kết nối, hủy request và giữ phần văn bản đã nhận là các hành vi có thể kiểm </w:t>
-      </w:r>
-      <w:r>
-        <w:t>thử. Không nên hiển thị success chỉ vì có một đoạn trả lời, khi stream chưa hoàn tất.</w:t>
+        <w:t>Đối với UI, offline là một trạng thái bình thường cần diễn đạt. Giữ bản nháp, báo mất kết nối, hủy request và giữ phần văn bản đã nhận là các hành vi có thể kiểm thử. Không nên hiển thị success chỉ vì có một đoạn trả lời, khi stream chưa hoàn tất.</w:t>
       </w:r>
     </w:p>
     <w:p>
@@ -1214,11 +1200,11 @@
         <w:jc w:val="both"/>
       </w:pPr>
       <w:r>
-        <w:t xml:space="preserve">Gọi trực tiếp giữ endpoint, giao thức và quyết định provider ở client. Người dùng sở hữu key và nhóm </w:t>
+        <w:t xml:space="preserve">Gọi trực tiếp giữ endpoint, giao thức và quyết định provider ở client. Người dùng sở hữu key và nhóm không tạo thêm một hệ thống trung gian nhìn thấy mọi cuộc trò chuyện. Đánh đổi là ứng dụng phải quản lý key </w:t>
       </w:r>
       <w:r>
         <w:lastRenderedPageBreak/>
-        <w:t>không tạo thêm một hệ thống trung gian nhìn thấy mọi cuộc trò chuyện. Đánh đổi là ứng dụng phải quản lý key trong phiên, phụ thuộc quyền trình duyệt và triển khai đúng ba giao thức phía client.</w:t>
+        <w:t>trong phiên, phụ thuộc quyền trình duyệt và triển khai đúng ba giao thức phía client.</w:t>
       </w:r>
     </w:p>
     <w:p>

</xml_diff>